<commit_message>
Strengthen pathway dedup and pool F02 across curated 4 DBs
</commit_message>
<xml_diff>
--- a/05_Figures/RESULTS_INTERPRETATION.docx
+++ b/05_Figures/RESULTS_INTERPRETATION.docx
@@ -245,6 +245,54 @@
       <w:r>
         <w:t xml:space="preserve">30:801) was applied at Π &lt; 0.05 alongside Benjamini-Hochberg FDR &lt; 0.10.</w:t>
       </w:r>
+      <w:r>
+        <w:t xml:space="preserve"> </w:t>
+      </w:r>
+      <w:r>
+        <w:t xml:space="preserve">Pathway enrichment (fgsea) was harmonized across the curated four-database</w:t>
+      </w:r>
+      <w:r>
+        <w:t xml:space="preserve"> </w:t>
+      </w:r>
+      <w:r>
+        <w:t xml:space="preserve">pool Hallmark + Reactome + KEGG + MitoCarta (rat-mapped). Redundancy</w:t>
+      </w:r>
+      <w:r>
+        <w:t xml:space="preserve"> </w:t>
+      </w:r>
+      <w:r>
+        <w:t xml:space="preserve">across databases was collapsed using the combined Jaccard / Overlap-</w:t>
+      </w:r>
+      <w:r>
+        <w:t xml:space="preserve"> </w:t>
+      </w:r>
+      <w:r>
+        <w:t xml:space="preserve">Coefficient criterion at threshold 0.5 (Merico et al. 2010, PLoS ONE</w:t>
+      </w:r>
+      <w:r>
+        <w:t xml:space="preserve"> </w:t>
+      </w:r>
+      <w:r>
+        <w:t xml:space="preserve">PMID 21085593; Reimand et al. 2019, Nat Protoc PMID 30664679, Box 1) —</w:t>
+      </w:r>
+      <w:r>
+        <w:t xml:space="preserve"> </w:t>
+      </w:r>
+      <w:r>
+        <w:t xml:space="preserve">the Jaccard pass handles symmetric overlap, and the Overlap-Coefficient</w:t>
+      </w:r>
+      <w:r>
+        <w:t xml:space="preserve"> </w:t>
+      </w:r>
+      <w:r>
+        <w:t xml:space="preserve">pass catches asymmetric containment where a small specialized set is</w:t>
+      </w:r>
+      <w:r>
+        <w:t xml:space="preserve"> </w:t>
+      </w:r>
+      <w:r>
+        <w:t xml:space="preserve">entirely inside a larger general set.</w:t>
+      </w:r>
     </w:p>
     <w:bookmarkEnd w:id="9"/>
     <w:bookmarkStart w:id="10" w:name="method-robustness"/>
@@ -354,25 +402,37 @@
         <w:t xml:space="preserve"> </w:t>
       </w:r>
       <w:r>
-        <w:t xml:space="preserve">PHEvPHE_MITO &gt; CTLvMITO &gt; CTLvPHE &gt; Interaction. After harmonizing</w:t>
-      </w:r>
-      <w:r>
-        <w:t xml:space="preserve"> </w:t>
-      </w:r>
-      <w:r>
-        <w:t xml:space="preserve">Hallmark, Reactome, and MitoCarta annotations and Jaccard-collapsing</w:t>
-      </w:r>
-      <w:r>
-        <w:t xml:space="preserve"> </w:t>
-      </w:r>
-      <w:r>
-        <w:t xml:space="preserve">redundant gene sets, 167 unique Π-significant DEPs survive, with 41</w:t>
-      </w:r>
-      <w:r>
-        <w:t xml:space="preserve"> </w:t>
-      </w:r>
-      <w:r>
-        <w:t xml:space="preserve">flagged as MitoCarta members. The mito-protein rank panel confirms</w:t>
+        <w:t xml:space="preserve">PHEvPHE_MITO &gt; CTLvMITO &gt; CTLvPHE &gt; Interaction. 167 unique</w:t>
+      </w:r>
+      <w:r>
+        <w:t xml:space="preserve"> </w:t>
+      </w:r>
+      <w:r>
+        <w:t xml:space="preserve">Π-significant DEPs survive across the four core contrasts; 41 are</w:t>
+      </w:r>
+      <w:r>
+        <w:t xml:space="preserve"> </w:t>
+      </w:r>
+      <w:r>
+        <w:t xml:space="preserve">MitoCarta members. After harmonizing the Hallmark + Reactome + MitoCarta</w:t>
+      </w:r>
+      <w:r>
+        <w:t xml:space="preserve"> </w:t>
+      </w:r>
+      <w:r>
+        <w:t xml:space="preserve">pathway annotations and collapsing redundancy with the combined</w:t>
+      </w:r>
+      <w:r>
+        <w:t xml:space="preserve"> </w:t>
+      </w:r>
+      <w:r>
+        <w:t xml:space="preserve">Jaccard / Overlap-Coefficient criterion (Methods), 82 unique pathways</w:t>
+      </w:r>
+      <w:r>
+        <w:t xml:space="preserve"> </w:t>
+      </w:r>
+      <w:r>
+        <w:t xml:space="preserve">appear in the enrichment panel. The mito-protein rank panel confirms</w:t>
       </w:r>
       <w:r>
         <w:t xml:space="preserve"> </w:t>
@@ -414,13 +474,13 @@
       </w:r>
     </w:p>
     <w:bookmarkEnd w:id="11"/>
-    <w:bookmarkStart w:id="12" w:name="X41003220c8c1dc3c132d1fa2f7d7e208215fd93"/>
+    <w:bookmarkStart w:id="12" w:name="X977a6dabd226ca69a9e548e83387035d9d3f89f"/>
     <w:p>
       <w:pPr>
         <w:pStyle w:val="Heading2"/>
       </w:pPr>
       <w:r>
-        <w:t xml:space="preserve">F02 — Contrast-resolved volcano landscape (mito lens canonical, GO-Slim and CORUM as supplements)</w:t>
+        <w:t xml:space="preserve">F02 — Contrast-resolved volcano landscape (curated 4-DB pooled canonical, +GO:BP supplement)</w:t>
       </w:r>
     </w:p>
     <w:p>
@@ -428,25 +488,37 @@
         <w:pStyle w:val="FirstParagraph"/>
       </w:pPr>
       <w:r>
-        <w:t xml:space="preserve">The 2 × 2 volcano-in-ring composite stratifies each contrast by MitoCarta</w:t>
-      </w:r>
-      <w:r>
-        <w:t xml:space="preserve"> </w:t>
-      </w:r>
-      <w:r>
-        <w:t xml:space="preserve">pathway (main figure) and additionally by CORUM protein complexes and GO-Slim</w:t>
-      </w:r>
-      <w:r>
-        <w:t xml:space="preserve"> </w:t>
-      </w:r>
-      <w:r>
-        <w:t xml:space="preserve">biological process (supplementary). The mito lens — chosen as canonical</w:t>
-      </w:r>
-      <w:r>
-        <w:t xml:space="preserve"> </w:t>
-      </w:r>
-      <w:r>
-        <w:t xml:space="preserve">because the experimental intervention is mitochondrial — shows:</w:t>
+        <w:t xml:space="preserve">The 2 × 2 volcano-in-ring composite pools four curated databases</w:t>
+      </w:r>
+      <w:r>
+        <w:t xml:space="preserve"> </w:t>
+      </w:r>
+      <w:r>
+        <w:t xml:space="preserve">(Hallmark + Reactome + KEGG + MitoCarta, rat-mapped) for the canonical</w:t>
+      </w:r>
+      <w:r>
+        <w:t xml:space="preserve"> </w:t>
+      </w:r>
+      <w:r>
+        <w:t xml:space="preserve">main figure, with an expanded supplement adding GO:BP for depth. Each</w:t>
+      </w:r>
+      <w:r>
+        <w:t xml:space="preserve"> </w:t>
+      </w:r>
+      <w:r>
+        <w:t xml:space="preserve">ring caps individual database contribution at two terms to prevent any</w:t>
+      </w:r>
+      <w:r>
+        <w:t xml:space="preserve"> </w:t>
+      </w:r>
+      <w:r>
+        <w:t xml:space="preserve">single database from dominating visual real-estate (Methods). Post-dedup</w:t>
+      </w:r>
+      <w:r>
+        <w:t xml:space="preserve"> </w:t>
+      </w:r>
+      <w:r>
+        <w:t xml:space="preserve">counts shown in the rings:</w:t>
       </w:r>
     </w:p>
     <w:p>
@@ -465,7 +537,7 @@
         <w:t xml:space="preserve">Transplant (CTLvMITO)</w:t>
       </w:r>
       <w:r>
-        <w:t xml:space="preserve">: 5 MitoCarta NES-significant pathways UP, 0 DOWN. OXPHOS subunits and mitoribosomal protein sets dominate.</w:t>
+        <w:t xml:space="preserve">: 9 pathways (6 up / 3 down). HALLMARK_OXIDATIVE_PHOSPHORYLATION is the strongest single signal (padj 1.3 × 10⁻⁶), with REACTOME_AEROBIC_RESPIRATION, MITOCARTA_MITORIBOSOME, MITOCARTA_TCA_CYCLE, and KEGG_GLYCOLYSIS triangulating the mitochondrial-delivery signature from four independent annotation perspectives.</w:t>
       </w:r>
     </w:p>
     <w:p>
@@ -484,7 +556,7 @@
         <w:t xml:space="preserve">Rescue (PHEvPHE_MITO)</w:t>
       </w:r>
       <w:r>
-        <w:t xml:space="preserve">: 6 MitoCarta pathways UP after Jaccard collapse (13 pre-collapse), 0 DOWN. Mito delivery continues under PHE stress.</w:t>
+        <w:t xml:space="preserve">: 11 pathways (6 up / 5 down). HALLMARK_OXPHOS dominates UP (padj 1.5 × 10⁻¹⁶, the strongest single signal in the dataset), with HALLMARK_FATTY_ACID_METABOLISM and REACTOME_MITOCHONDRIAL_PROTEIN_DEGRADATION also UP. HALLMARK_EPITHELIAL_MESENCHYMAL_TRANSITION, REACTOME_COLLAGEN_TRIMERIZATION, and FIBRONECTIN_MATRIX are DOWN — the reverse-image of the PHE-induced fibrotic signature (rescue of disease).</w:t>
       </w:r>
     </w:p>
     <w:p>
@@ -503,7 +575,7 @@
         <w:t xml:space="preserve">Disease (CTLvPHE)</w:t>
       </w:r>
       <w:r>
-        <w:t xml:space="preserve">: 0 MitoCarta pathways pass NES significance with the harmonized collection — α1-adrenergic stress is not predominantly mitochondrial at the pathway level.</w:t>
+        <w:t xml:space="preserve">: 8 pathways (5 up / 3 down) — populated for the first time under the pooled lens. KEGG_ECM_RECEPTOR_INTERACTION (padj 0.002), REACTOME_STRIATED_MUSCLE_CONTRACTION (padj 0.007), REACTOME_FORMATION_OF_DYSTROPHIN_GLYCOPROTEIN_COMPLEX, HALLMARK_EPITHELIAL_MESENCHYMAL_TRANSITION, and KEGG_DILATED_CARDIOMYOPATHY are UP, recovering the Hahn 2014 (PMID 24794531) PHE-driven fibrotic / sarcomeric / ECM-remodeling axis at pathway resolution. HALLMARK_MYC_TARGETS_V1, REACTOME_DNA_REPLICATION, and HALLMARK_E2F_TARGETS are DOWN — proliferation arrest paired with hypertrophy, classic for terminally-differentiating cardiomyoblasts under α1-adrenergic stress.</w:t>
       </w:r>
     </w:p>
     <w:p>
@@ -522,7 +594,7 @@
         <w:t xml:space="preserve">Interaction</w:t>
       </w:r>
       <w:r>
-        <w:t xml:space="preserve">: 2 MitoCarta pathways with positive NES, descriptive only.</w:t>
+        <w:t xml:space="preserve">: 11 pathways (descriptive only at N = 24).</w:t>
       </w:r>
     </w:p>
     <w:p>
@@ -530,19 +602,25 @@
         <w:pStyle w:val="FirstParagraph"/>
       </w:pPr>
       <w:r>
-        <w:t xml:space="preserve">The CORUM and GO-Slim variants in the supplement provide complementary</w:t>
-      </w:r>
-      <w:r>
-        <w:t xml:space="preserve"> </w:t>
-      </w:r>
-      <w:r>
-        <w:t xml:space="preserve">biological-process and macromolecular-complex framing without changing the</w:t>
-      </w:r>
-      <w:r>
-        <w:t xml:space="preserve"> </w:t>
-      </w:r>
-      <w:r>
-        <w:t xml:space="preserve">contrast-level conclusion.</w:t>
+        <w:t xml:space="preserve">The expanded supplement (Figure S2, adds GO:BP) provides depth for</w:t>
+      </w:r>
+      <w:r>
+        <w:t xml:space="preserve"> </w:t>
+      </w:r>
+      <w:r>
+        <w:t xml:space="preserve">readers interested in finer-resolution biological-process terms;</w:t>
+      </w:r>
+      <w:r>
+        <w:t xml:space="preserve"> </w:t>
+      </w:r>
+      <w:r>
+        <w:t xml:space="preserve">GO:BP-tagged actin / sarcomere / muscle-organ-development terms</w:t>
+      </w:r>
+      <w:r>
+        <w:t xml:space="preserve"> </w:t>
+      </w:r>
+      <w:r>
+        <w:t xml:space="preserve">triangulate the curated-DB findings for the Disease panel.</w:t>
       </w:r>
     </w:p>
     <w:bookmarkEnd w:id="12"/>
@@ -757,25 +835,37 @@
         <w:t xml:space="preserve"> </w:t>
       </w:r>
       <w:r>
-        <w:t xml:space="preserve">0.78–0.83) shows that 49 sets pass FDR &lt; 0.05 under PHE+Mito Rescue,</w:t>
-      </w:r>
-      <w:r>
-        <w:t xml:space="preserve"> </w:t>
-      </w:r>
-      <w:r>
-        <w:t xml:space="preserve">21 under Transplant, 0 under Disease and Interaction. The two stronger</w:t>
-      </w:r>
-      <w:r>
-        <w:t xml:space="preserve"> </w:t>
-      </w:r>
-      <w:r>
-        <w:t xml:space="preserve">contrasts clear the methodological-agreement floor (ρ &gt; 0.80); the two</w:t>
-      </w:r>
-      <w:r>
-        <w:t xml:space="preserve"> </w:t>
-      </w:r>
-      <w:r>
-        <w:t xml:space="preserve">weaker contrasts sit just below (0.79 and 0.78), consistent with noisier</w:t>
+        <w:t xml:space="preserve">0.77–0.82) shows that 12 sets pass FDR &lt; 0.05 under PHE+Mito Rescue,</w:t>
+      </w:r>
+      <w:r>
+        <w:t xml:space="preserve"> </w:t>
+      </w:r>
+      <w:r>
+        <w:t xml:space="preserve">9 under Transplant, 0 under Disease and Interaction (after stricter</w:t>
+      </w:r>
+      <w:r>
+        <w:t xml:space="preserve"> </w:t>
+      </w:r>
+      <w:r>
+        <w:t xml:space="preserve">combined Jaccard / Overlap-Coefficient dedup of the harmonized</w:t>
+      </w:r>
+      <w:r>
+        <w:t xml:space="preserve"> </w:t>
+      </w:r>
+      <w:r>
+        <w:t xml:space="preserve">collection, 1,625 → 416 sets). The two stronger contrasts clear or</w:t>
+      </w:r>
+      <w:r>
+        <w:t xml:space="preserve"> </w:t>
+      </w:r>
+      <w:r>
+        <w:t xml:space="preserve">sit at the methodological-agreement floor (ρ ≥ 0.80); the two weaker</w:t>
+      </w:r>
+      <w:r>
+        <w:t xml:space="preserve"> </w:t>
+      </w:r>
+      <w:r>
+        <w:t xml:space="preserve">contrasts sit just below (0.78 and 0.77), consistent with noisier</w:t>
       </w:r>
       <w:r>
         <w:t xml:space="preserve"> </w:t>
@@ -2060,6 +2150,144 @@
         <w:t xml:space="preserve">selection and ranking. Bioinformatics. 2014;30(6):801-7. PMID 22321699.</w:t>
       </w:r>
     </w:p>
+    <w:p>
+      <w:pPr>
+        <w:pStyle w:val="Compact"/>
+        <w:numPr>
+          <w:ilvl w:val="0"/>
+          <w:numId w:val="1003"/>
+        </w:numPr>
+      </w:pPr>
+      <w:r>
+        <w:t xml:space="preserve">Subramanian A, Tamayo P, Mootha VK, et al. Gene set enrichment analysis:</w:t>
+      </w:r>
+      <w:r>
+        <w:t xml:space="preserve"> </w:t>
+      </w:r>
+      <w:r>
+        <w:t xml:space="preserve">a knowledge-based approach for interpreting genome-wide expression</w:t>
+      </w:r>
+      <w:r>
+        <w:t xml:space="preserve"> </w:t>
+      </w:r>
+      <w:r>
+        <w:t xml:space="preserve">profiles. Proc Natl Acad Sci U S A. 2005;102(43):15545-50. PMID 16199517.</w:t>
+      </w:r>
+    </w:p>
+    <w:p>
+      <w:pPr>
+        <w:pStyle w:val="Compact"/>
+        <w:numPr>
+          <w:ilvl w:val="0"/>
+          <w:numId w:val="1003"/>
+        </w:numPr>
+      </w:pPr>
+      <w:r>
+        <w:t xml:space="preserve">Liberzon A, Birger C, Thorvaldsdóttir H, et al. The Molecular Signatures</w:t>
+      </w:r>
+      <w:r>
+        <w:t xml:space="preserve"> </w:t>
+      </w:r>
+      <w:r>
+        <w:t xml:space="preserve">Database (MSigDB) hallmark gene set collection. Cell Syst.</w:t>
+      </w:r>
+      <w:r>
+        <w:t xml:space="preserve"> </w:t>
+      </w:r>
+      <w:r>
+        <w:t xml:space="preserve">2015;1(6):417-425. PMID 26771021.</w:t>
+      </w:r>
+    </w:p>
+    <w:p>
+      <w:pPr>
+        <w:pStyle w:val="Compact"/>
+        <w:numPr>
+          <w:ilvl w:val="0"/>
+          <w:numId w:val="1003"/>
+        </w:numPr>
+      </w:pPr>
+      <w:r>
+        <w:t xml:space="preserve">Gillespie M, Jassal B, Stephan R, et al. The Reactome pathway</w:t>
+      </w:r>
+      <w:r>
+        <w:t xml:space="preserve"> </w:t>
+      </w:r>
+      <w:r>
+        <w:t xml:space="preserve">knowledgebase 2022. Nucleic Acids Res. 2022;50(D1):D687-D692.</w:t>
+      </w:r>
+      <w:r>
+        <w:t xml:space="preserve"> </w:t>
+      </w:r>
+      <w:r>
+        <w:t xml:space="preserve">PMID 34788843.</w:t>
+      </w:r>
+    </w:p>
+    <w:p>
+      <w:pPr>
+        <w:pStyle w:val="Compact"/>
+        <w:numPr>
+          <w:ilvl w:val="0"/>
+          <w:numId w:val="1003"/>
+        </w:numPr>
+      </w:pPr>
+      <w:r>
+        <w:t xml:space="preserve">Kanehisa M. Toward understanding the origin and evolution of cellular</w:t>
+      </w:r>
+      <w:r>
+        <w:t xml:space="preserve"> </w:t>
+      </w:r>
+      <w:r>
+        <w:t xml:space="preserve">organisms. Protein Sci. 2019;28(11):1947-1951. PMID 31441146.</w:t>
+      </w:r>
+    </w:p>
+    <w:p>
+      <w:pPr>
+        <w:pStyle w:val="Compact"/>
+        <w:numPr>
+          <w:ilvl w:val="0"/>
+          <w:numId w:val="1003"/>
+        </w:numPr>
+      </w:pPr>
+      <w:r>
+        <w:t xml:space="preserve">Merico D, Isserlin R, Stueker O, Emili A, Bader GD. Enrichment map:</w:t>
+      </w:r>
+      <w:r>
+        <w:t xml:space="preserve"> </w:t>
+      </w:r>
+      <w:r>
+        <w:t xml:space="preserve">a network-based method for gene-set enrichment visualization and</w:t>
+      </w:r>
+      <w:r>
+        <w:t xml:space="preserve"> </w:t>
+      </w:r>
+      <w:r>
+        <w:t xml:space="preserve">interpretation. PLoS ONE. 2010;5(11):e13984. PMID 21085593.</w:t>
+      </w:r>
+    </w:p>
+    <w:p>
+      <w:pPr>
+        <w:pStyle w:val="Compact"/>
+        <w:numPr>
+          <w:ilvl w:val="0"/>
+          <w:numId w:val="1003"/>
+        </w:numPr>
+      </w:pPr>
+      <w:r>
+        <w:t xml:space="preserve">Reimand J, Isserlin R, Voisin V, et al. Pathway enrichment analysis</w:t>
+      </w:r>
+      <w:r>
+        <w:t xml:space="preserve"> </w:t>
+      </w:r>
+      <w:r>
+        <w:t xml:space="preserve">and visualization of omics data using g:Profiler, GSEA, Cytoscape</w:t>
+      </w:r>
+      <w:r>
+        <w:t xml:space="preserve"> </w:t>
+      </w:r>
+      <w:r>
+        <w:t xml:space="preserve">and EnrichmentMap. Nat Protoc. 2019;14(2):482-517. PMID 30664679.</w:t>
+      </w:r>
+    </w:p>
     <w:bookmarkEnd w:id="24"/>
     <w:sectPr>
       <w:footnotePr>

</xml_diff>